<commit_message>
draft specificity and detailing
</commit_message>
<xml_diff>
--- a/data/NyayChat/Chat/10.docx
+++ b/data/NyayChat/Chat/10.docx
@@ -711,7 +711,7 @@
         <w:rPr>
           <w:rtl w:val="0"/>
         </w:rPr>
-        <w:t xml:space="preserve">Here is a detailed guideline to file a complaint online in the E-Dakhil Portal.</w:t>
+        <w:t xml:space="preserve">Here is a detailed guideline to file a complaint online in the e-Jagriti Portal.</w:t>
       </w:r>
     </w:p>
     <w:p>
@@ -736,7 +736,7 @@
             <w:u w:val="single"/>
             <w:rtl w:val="0"/>
           </w:rPr>
-          <w:t xml:space="preserve">e-Daakhil </w:t>
+          <w:t xml:space="preserve">e-Jagriti </w:t>
         </w:r>
       </w:hyperlink>
       <w:r>
@@ -1109,7 +1109,7 @@
         <w:rPr>
           <w:rtl w:val="0"/>
         </w:rPr>
-        <w:t xml:space="preserve">e-daakhil</w:t>
+        <w:t xml:space="preserve">e-Jagriti</w:t>
       </w:r>
       <w:r>
         <w:rPr>
@@ -1189,7 +1189,7 @@
         <w:rPr>
           <w:rtl w:val="0"/>
         </w:rPr>
-        <w:t xml:space="preserve">e-daakhil</w:t>
+        <w:t xml:space="preserve">e-Jagriti</w:t>
       </w:r>
       <w:r>
         <w:rPr>
@@ -1387,7 +1387,7 @@
     <w:name w:val="normal"/>
   </w:style>
   <w:style w:type="table" w:styleId="TableNormal" w:default="1">
-    <w:name w:val="Table Normal"/>
+    <w:name w:val="TableNormal"/>
   </w:style>
   <w:style w:type="paragraph" w:styleId="Heading1">
     <w:name w:val="heading 1"/>

</xml_diff>